<commit_message>
Remove all em/en dashes from profile summary
Replace em/en dashes with parentheses, colons, commas and plain hyphens
per owner preference; both deliverables now dash-free.

Co-Authored-By: Claude Opus 4.8 <noreply@anthropic.com>
Claude-Session: https://claude.ai/code/session_01TuhM6r1rkWffWN6sdrTeQ9
</commit_message>
<xml_diff>
--- a/job-search/pipeline/infosys-consulting--data-engineer/Dhruv_Nirmal_Profile_Summary.docx
+++ b/job-search/pipeline/infosys-consulting--data-engineer/Dhruv_Nirmal_Profile_Summary.docx
@@ -73,7 +73,7 @@
           <w:color w:val="595959"/>
           <w:sz w:val="17"/>
         </w:rPr>
-        <w:t>Data Engineer, Purchasing Index Data Analytics (Comprara Group), Melbourne  ·  Jun 2024 – Present</w:t>
+        <w:t>Data Engineer, Purchasing Index Data Analytics (Comprara Group), Melbourne  ·  Jun 2024 to Present</w:t>
       </w:r>
     </w:p>
     <w:p>
@@ -147,7 +147,7 @@
           <w:color w:val="222222"/>
           <w:sz w:val="20"/>
         </w:rPr>
-        <w:t xml:space="preserve"> — ingestion, validation, transformation and reporting — across </w:t>
+        <w:t xml:space="preserve"> (ingestion, validation, transformation and reporting) across </w:t>
       </w:r>
       <w:r>
         <w:rPr>
@@ -207,7 +207,7 @@
           <w:color w:val="222222"/>
           <w:sz w:val="20"/>
         </w:rPr>
-        <w:t xml:space="preserve"> built into every build. Works across the modern data stack — </w:t>
+        <w:t xml:space="preserve"> built into every build. Works across the modern data stack: </w:t>
       </w:r>
       <w:r>
         <w:rPr>
@@ -557,7 +557,7 @@
           <w:color w:val="1F385C"/>
           <w:sz w:val="19"/>
         </w:rPr>
-        <w:t xml:space="preserve">Flagship pipeline — 6M rows/week: </w:t>
+        <w:t xml:space="preserve">Flagship pipeline (6M rows/week): </w:t>
       </w:r>
       <w:r>
         <w:rPr>
@@ -567,7 +567,7 @@
           <w:color w:val="222222"/>
           <w:sz w:val="19"/>
         </w:rPr>
-        <w:t>Replaced a 4–5 hour manual weekly process with a ~75-minute automated run over ~6 million invoice rows across 5 global regions and 13 sub-regions, using Microsoft Graph API ingestion into SQL Server with automated validation (≈3–3.5 hours saved every week).</w:t>
+        <w:t>Replaced a 4-5 hour manual weekly process with a ~75-minute automated run over ~6 million invoice rows across 5 global regions and 13 sub-regions, using Microsoft Graph API ingestion into SQL Server with automated validation (~3-3.5 hours saved every week).</w:t>
       </w:r>
     </w:p>
     <w:p>
@@ -584,7 +584,7 @@
           <w:color w:val="1F385C"/>
           <w:sz w:val="19"/>
         </w:rPr>
-        <w:t xml:space="preserve">Self-service refresh app — 26 accounts (current): </w:t>
+        <w:t xml:space="preserve">Self-service refresh app (26 accounts, current): </w:t>
       </w:r>
       <w:r>
         <w:rPr>
@@ -594,7 +594,7 @@
           <w:color w:val="222222"/>
           <w:sz w:val="19"/>
         </w:rPr>
-        <w:t>Leading a company-wide app that standardises one-click pipeline refreshes, full and incremental, across all 26 client accounts, maintained end to end in Git — turning a specialist manual task into a run anyone on the team can trigger.</w:t>
+        <w:t>Leading a company-wide app that standardises one-click pipeline refreshes, full and incremental, across all 26 client accounts, maintained end to end in Git, turning a specialist manual task into a run anyone on the team can trigger.</w:t>
       </w:r>
     </w:p>
     <w:p>
@@ -611,7 +611,7 @@
           <w:color w:val="1F385C"/>
           <w:sz w:val="19"/>
         </w:rPr>
-        <w:t xml:space="preserve">Large-scale categorisation — ~A$12B spend: </w:t>
+        <w:t xml:space="preserve">Large-scale categorisation (~A$12B spend): </w:t>
       </w:r>
       <w:r>
         <w:rPr>
@@ -638,7 +638,7 @@
           <w:color w:val="1F385C"/>
           <w:sz w:val="19"/>
         </w:rPr>
-        <w:t xml:space="preserve">Distributed processing — Databricks &amp; PySpark: </w:t>
+        <w:t xml:space="preserve">Distributed processing (Databricks &amp; PySpark): </w:t>
       </w:r>
       <w:r>
         <w:rPr>
@@ -746,7 +746,7 @@
           <w:color w:val="595959"/>
           <w:sz w:val="19"/>
         </w:rPr>
-        <w:t xml:space="preserve">   —   Monash University, Melbourne  ·  2022 – 2023</w:t>
+        <w:t xml:space="preserve">   ·   Monash University, Melbourne (2022-2023)</w:t>
       </w:r>
     </w:p>
     <w:p>
@@ -771,7 +771,7 @@
           <w:color w:val="595959"/>
           <w:sz w:val="19"/>
         </w:rPr>
-        <w:t xml:space="preserve">   —   Thapar University  ·  2017 – 2021</w:t>
+        <w:t xml:space="preserve">   ·   Thapar University (2017-2021)</w:t>
       </w:r>
     </w:p>
     <w:sectPr>

</xml_diff>

<commit_message>
Make LinkedIn, GitHub and email clickable in profile summary
Convert the contact-line LinkedIn/GitHub/email text into real external
hyperlinks (blue, underlined).

Co-Authored-By: Claude Opus 4.8 <noreply@anthropic.com>
Claude-Session: https://claude.ai/code/session_01TuhM6r1rkWffWN6sdrTeQ9
</commit_message>
<xml_diff>
--- a/job-search/pipeline/infosys-consulting--data-engineer/Dhruv_Nirmal_Profile_Summary.docx
+++ b/job-search/pipeline/infosys-consulting--data-engineer/Dhruv_Nirmal_Profile_Summary.docx
@@ -45,8 +45,61 @@
           <w:color w:val="595959"/>
           <w:sz w:val="17"/>
         </w:rPr>
-        <w:t>Melbourne, Australia   |   dhruvnirmal2111@gmail.com   |   +61 406 259 619   |   linkedin.com/in/dhruv-nirmal-data   |   github.com/dhruvnirmal2111-max</w:t>
+        <w:t xml:space="preserve">Melbourne, Australia   |   </w:t>
       </w:r>
+      <w:hyperlink r:id="rId9">
+        <w:r>
+          <w:rPr>
+            <w:rFonts w:ascii="Arial" w:hAnsi="Arial"/>
+            <w:sz w:val="17"/>
+            <w:color w:val="2E74B5"/>
+            <w:u w:val="single"/>
+          </w:rPr>
+          <w:t xml:space="preserve">dhruvnirmal2111@gmail.com</w:t>
+        </w:r>
+      </w:hyperlink>
+      <w:r>
+        <w:rPr>
+          <w:rFonts w:ascii="Arial" w:hAnsi="Arial"/>
+          <w:b w:val="0"/>
+          <w:i w:val="0"/>
+          <w:color w:val="595959"/>
+          <w:sz w:val="17"/>
+        </w:rPr>
+        <w:t xml:space="preserve">   |   +61 406 259 619   |   </w:t>
+      </w:r>
+      <w:hyperlink r:id="rId10">
+        <w:r>
+          <w:rPr>
+            <w:rFonts w:ascii="Arial" w:hAnsi="Arial"/>
+            <w:sz w:val="17"/>
+            <w:color w:val="2E74B5"/>
+            <w:u w:val="single"/>
+          </w:rPr>
+          <w:t xml:space="preserve">linkedin.com/in/dhruv-nirmal-data</w:t>
+        </w:r>
+      </w:hyperlink>
+      <w:r>
+        <w:rPr>
+          <w:rFonts w:ascii="Arial" w:hAnsi="Arial"/>
+          <w:b w:val="0"/>
+          <w:i w:val="0"/>
+          <w:color w:val="595959"/>
+          <w:sz w:val="17"/>
+        </w:rPr>
+        <w:t xml:space="preserve">   |   </w:t>
+      </w:r>
+      <w:hyperlink r:id="rId11">
+        <w:r>
+          <w:rPr>
+            <w:rFonts w:ascii="Arial" w:hAnsi="Arial"/>
+            <w:sz w:val="17"/>
+            <w:color w:val="2E74B5"/>
+            <w:u w:val="single"/>
+          </w:rPr>
+          <w:t xml:space="preserve">github.com/dhruvnirmal2111-max</w:t>
+        </w:r>
+      </w:hyperlink>
     </w:p>
     <w:p>
       <w:pPr>

</xml_diff>

<commit_message>
Confine Databricks/PySpark to internship context in both profiles
Remove Databricks/PySpark from current-role narrative (PPTX background line
and DOCX summary); mention them only as internship experience so the
hands-on-vs-current distinction is unambiguous.

Co-Authored-By: Claude Opus 4.8 <noreply@anthropic.com>
Claude-Session: https://claude.ai/code/session_01TuhM6r1rkWffWN6sdrTeQ9
</commit_message>
<xml_diff>
--- a/job-search/pipeline/infosys-consulting--data-engineer/Dhruv_Nirmal_Profile_Summary.docx
+++ b/job-search/pipeline/infosys-consulting--data-engineer/Dhruv_Nirmal_Profile_Summary.docx
@@ -260,27 +260,7 @@
           <w:color w:val="222222"/>
           <w:sz w:val="20"/>
         </w:rPr>
-        <w:t xml:space="preserve"> built into every build. Works across the modern data stack: </w:t>
-      </w:r>
-      <w:r>
-        <w:rPr>
-          <w:rFonts w:ascii="Arial" w:hAnsi="Arial"/>
-          <w:b/>
-          <w:i w:val="0"/>
-          <w:color w:val="222222"/>
-          <w:sz w:val="20"/>
-        </w:rPr>
-        <w:t>Databricks and PySpark</w:t>
-      </w:r>
-      <w:r>
-        <w:rPr>
-          <w:rFonts w:ascii="Arial" w:hAnsi="Arial"/>
-          <w:b w:val="0"/>
-          <w:i w:val="0"/>
-          <w:color w:val="222222"/>
-          <w:sz w:val="20"/>
-        </w:rPr>
-        <w:t xml:space="preserve"> for distributed processing, </w:t>
+        <w:t xml:space="preserve"> built into every build. Works comfortably across cloud on </w:t>
       </w:r>
       <w:r>
         <w:rPr>
@@ -300,7 +280,7 @@
           <w:color w:val="222222"/>
           <w:sz w:val="20"/>
         </w:rPr>
-        <w:t xml:space="preserve"> for cloud, and </w:t>
+        <w:t xml:space="preserve"> and reporting in </w:t>
       </w:r>
       <w:r>
         <w:rPr>
@@ -320,7 +300,7 @@
           <w:color w:val="222222"/>
           <w:sz w:val="20"/>
         </w:rPr>
-        <w:t xml:space="preserve"> for reporting.</w:t>
+        <w:t>, and brings hands-on distributed-processing experience (Databricks, PySpark) from an internship.</w:t>
       </w:r>
     </w:p>
     <w:p>

</xml_diff>